<commit_message>
Change inversion procedure and plotting
</commit_message>
<xml_diff>
--- a/Example/Readme_example.docx
+++ b/Example/Readme_example.docx
@@ -3,7 +3,15 @@
 <w:document xmlns:wpc="http://schemas.microsoft.com/office/word/2010/wordprocessingCanvas" xmlns:cx="http://schemas.microsoft.com/office/drawing/2014/chartex" xmlns:cx1="http://schemas.microsoft.com/office/drawing/2015/9/8/chartex" xmlns:cx2="http://schemas.microsoft.com/office/drawing/2015/10/21/chartex" xmlns:cx3="http://schemas.microsoft.com/office/drawing/2016/5/9/chartex" xmlns:cx4="http://schemas.microsoft.com/office/drawing/2016/5/10/chartex" xmlns:cx5="http://schemas.microsoft.com/office/drawing/2016/5/11/chartex" xmlns:cx6="http://schemas.microsoft.com/office/drawing/2016/5/12/chartex" xmlns:cx7="http://schemas.microsoft.com/office/drawing/2016/5/13/chartex" xmlns:cx8="http://schemas.microsoft.com/office/drawing/2016/5/14/chartex" xmlns:mc="http://schemas.openxmlformats.org/markup-compatibility/2006" xmlns:aink="http://schemas.microsoft.com/office/drawing/2016/ink" xmlns:am3d="http://schemas.microsoft.com/office/drawing/2017/model3d" xmlns:o="urn:schemas-microsoft-com:office:office" xmlns:oel="http://schemas.microsoft.com/office/2019/extlst" xmlns:r="http://schemas.openxmlformats.org/officeDocument/2006/relationships" xmlns:m="http://schemas.openxmlformats.org/officeDocument/2006/math" xmlns:v="urn:schemas-microsoft-com:vml" xmlns:wp14="http://schemas.microsoft.com/office/word/2010/wordprocessingDrawing" xmlns:wp="http://schemas.openxmlformats.org/drawingml/2006/wordprocessingDrawing" xmlns:w10="urn:schemas-microsoft-com:office:word" xmlns:w="http://schemas.openxmlformats.org/wordprocessingml/2006/main" xmlns:w14="http://schemas.microsoft.com/office/word/2010/wordml" xmlns:w15="http://schemas.microsoft.com/office/word/2012/wordml" xmlns:w16cex="http://schemas.microsoft.com/office/word/2018/wordml/cex" xmlns:w16cid="http://schemas.microsoft.com/office/word/2016/wordml/cid" xmlns:w16="http://schemas.microsoft.com/office/word/2018/wordml" xmlns:w16du="http://schemas.microsoft.com/office/word/2023/wordml/word16du" xmlns:w16sdtdh="http://schemas.microsoft.com/office/word/2020/wordml/sdtdatahash" xmlns:w16sdtfl="http://schemas.microsoft.com/office/word/2024/wordml/sdtformatlock" xmlns:w16se="http://schemas.microsoft.com/office/word/2015/wordml/symex" xmlns:wpg="http://schemas.microsoft.com/office/word/2010/wordprocessingGroup" xmlns:wpi="http://schemas.microsoft.com/office/word/2010/wordprocessingInk" xmlns:wne="http://schemas.microsoft.com/office/word/2006/wordml" xmlns:wps="http://schemas.microsoft.com/office/word/2010/wordprocessingShape" mc:Ignorable="w14 w15 w16se w16cid w16 w16cex w16sdtdh w16sdtfl w16du wp14">
   <w:body>
     <w:p>
-      <w:r>
+      <w:pPr>
+        <w:rPr>
+          <w:lang w:val="en-US"/>
+        </w:rPr>
+      </w:pPr>
+      <w:r>
+        <w:rPr>
+          <w:lang w:val="en-US"/>
+        </w:rPr>
         <w:t>Example data :</w:t>
       </w:r>
     </w:p>
@@ -36,75 +44,13 @@
         <w:rPr>
           <w:lang w:val="en-US"/>
         </w:rPr>
-        <w:t xml:space="preserve">Rename </w:t>
-      </w:r>
-      <w:proofErr w:type="spellStart"/>
-      <w:r>
-        <w:rPr>
-          <w:lang w:val="en-US"/>
-        </w:rPr>
-        <w:t>picks.sgt</w:t>
-      </w:r>
-      <w:proofErr w:type="spellEnd"/>
-      <w:r>
-        <w:rPr>
-          <w:lang w:val="en-US"/>
-        </w:rPr>
-        <w:t xml:space="preserve"> to any other name (e.g. pick1.sgt), start </w:t>
-      </w:r>
-      <w:proofErr w:type="spellStart"/>
-      <w:r>
-        <w:rPr>
-          <w:lang w:val="en-US"/>
-        </w:rPr>
-        <w:t>reframodel</w:t>
-      </w:r>
-      <w:proofErr w:type="spellEnd"/>
-      <w:r>
-        <w:rPr>
-          <w:lang w:val="en-US"/>
-        </w:rPr>
-        <w:t>. When asked whether you want to open another pick file, say no and when asked to choose a model, click on abandon (or whatever it is on English systems, so don’t choose an existing model). Then you will be asked for the geometry of the synthetic model you want to create as described in the manual.</w:t>
-      </w:r>
-      <w:r>
-        <w:rPr>
-          <w:lang w:val="en-US"/>
-        </w:rPr>
-        <w:t xml:space="preserve"> The resulting figures are shown in folder “Figures/</w:t>
-      </w:r>
-      <w:proofErr w:type="spellStart"/>
-      <w:r>
-        <w:rPr>
-          <w:lang w:val="en-US"/>
-        </w:rPr>
-        <w:t>No_</w:t>
-      </w:r>
-      <w:proofErr w:type="gramStart"/>
-      <w:r>
-        <w:rPr>
-          <w:lang w:val="en-US"/>
-        </w:rPr>
-        <w:t>starting</w:t>
-      </w:r>
-      <w:proofErr w:type="spellEnd"/>
-      <w:r>
-        <w:rPr>
-          <w:lang w:val="en-US"/>
-        </w:rPr>
-        <w:t>-model</w:t>
-      </w:r>
-      <w:proofErr w:type="gramEnd"/>
-      <w:r>
-        <w:rPr>
-          <w:lang w:val="en-US"/>
-        </w:rPr>
-        <w:t xml:space="preserve">”, after having reduced the data </w:t>
-      </w:r>
-      <w:r>
-        <w:rPr>
-          <w:lang w:val="en-US"/>
-        </w:rPr>
-        <w:t>as shown in Figure “</w:t>
+        <w:t>Rename picks.sgt to any other name (e.g. pick1.sgt), start reframodel. When asked whether you want to open another pick file, say no and when asked to choose a model, click on abandon (or whatever it is on English systems, so don’t choose an existing model). Then you will be asked for the geometry of the synthetic model you want to create as described in the manual.</w:t>
+      </w:r>
+      <w:r>
+        <w:rPr>
+          <w:lang w:val="en-US"/>
+        </w:rPr>
+        <w:t xml:space="preserve"> The resulting figures are shown in folder “Figures/No_starting-model”, after having reduced the data as shown in Figure “</w:t>
       </w:r>
       <w:r>
         <w:rPr>
@@ -128,13 +74,7 @@
         <w:rPr>
           <w:lang w:val="en-US"/>
         </w:rPr>
-        <w:t>”.</w:t>
-      </w:r>
-      <w:r>
-        <w:rPr>
-          <w:lang w:val="en-US"/>
-        </w:rPr>
-        <w:t xml:space="preserve"> Then run “Tools/Run Forward Model” to get the figure with calculated arrival times.</w:t>
+        <w:t>”. Then run “Tools/Run Forward Model” to get the figure with calculated arrival times.</w:t>
       </w:r>
     </w:p>
     <w:p>
@@ -195,21 +135,7 @@
         <w:rPr>
           <w:lang w:val="en-US"/>
         </w:rPr>
-        <w:t xml:space="preserve">, let file </w:t>
-      </w:r>
-      <w:proofErr w:type="spellStart"/>
-      <w:r>
-        <w:rPr>
-          <w:lang w:val="en-US"/>
-        </w:rPr>
-        <w:t>picks.sgt</w:t>
-      </w:r>
-      <w:proofErr w:type="spellEnd"/>
-      <w:r>
-        <w:rPr>
-          <w:lang w:val="en-US"/>
-        </w:rPr>
-        <w:t xml:space="preserve"> untouched and start the program </w:t>
+        <w:t xml:space="preserve">, let file picks.sgt untouched and start the program </w:t>
       </w:r>
       <w:r>
         <w:rPr>
@@ -239,13 +165,7 @@
         <w:rPr>
           <w:lang w:val="en-US"/>
         </w:rPr>
-        <w:t xml:space="preserve">.txt” as existing model and reducing the number of picks </w:t>
-      </w:r>
-      <w:r>
-        <w:rPr>
-          <w:lang w:val="en-US"/>
-        </w:rPr>
-        <w:t>as shown in Figure “</w:t>
+        <w:t>.txt” as existing model and reducing the number of picks as shown in Figure “</w:t>
       </w:r>
       <w:r>
         <w:rPr>
@@ -269,19 +189,7 @@
         <w:rPr>
           <w:lang w:val="en-US"/>
         </w:rPr>
-        <w:t>”.</w:t>
-      </w:r>
-      <w:r>
-        <w:rPr>
-          <w:lang w:val="en-US"/>
-        </w:rPr>
-        <w:t xml:space="preserve"> Run </w:t>
-      </w:r>
-      <w:r>
-        <w:rPr>
-          <w:lang w:val="en-US"/>
-        </w:rPr>
-        <w:t>“Tools/Run Forward Model” to get the figure with calculated arrival times.</w:t>
+        <w:t>”. Run “Tools/Run Forward Model” to get the figure with calculated arrival times.</w:t>
       </w:r>
     </w:p>
     <w:p>
@@ -300,22 +208,14 @@
         <w:rPr>
           <w:lang w:val="en-US"/>
         </w:rPr>
-        <w:t>two inversion results, run the inversion (“Tools/Inversion Parameters…”) once with a simple gradient starting model (folder “</w:t>
-      </w:r>
-      <w:r>
-        <w:rPr>
-          <w:lang w:val="en-US"/>
-        </w:rPr>
-        <w:t>Figures/</w:t>
-      </w:r>
-      <w:proofErr w:type="spellStart"/>
+        <w:t>two inversion results, run the inversion (“Tools/Inversion Parameters…”) once with a simple gradient starting model (folder “Figures/</w:t>
+      </w:r>
       <w:r>
         <w:rPr>
           <w:lang w:val="en-US"/>
         </w:rPr>
         <w:t>Inversion_gradient</w:t>
       </w:r>
-      <w:proofErr w:type="spellEnd"/>
       <w:r>
         <w:rPr>
           <w:lang w:val="en-US"/>
@@ -332,19 +232,43 @@
         <w:rPr>
           <w:lang w:val="en-US"/>
         </w:rPr>
-        <w:t>”, and then starting with the interactive model (folder “Figures/</w:t>
-      </w:r>
-      <w:r>
-        <w:rPr>
-          <w:lang w:val="en-US"/>
-        </w:rPr>
-        <w:t>Inversion-interactive-model</w:t>
-      </w:r>
-      <w:r>
-        <w:rPr>
-          <w:lang w:val="en-US"/>
-        </w:rPr>
-        <w:t>”), using the parameters shown in file “</w:t>
+        <w:t>”</w:t>
+      </w:r>
+      <w:r>
+        <w:rPr>
+          <w:lang w:val="en-US"/>
+        </w:rPr>
+        <w:t xml:space="preserve"> (the </w:t>
+      </w:r>
+      <w:r>
+        <w:rPr>
+          <w:lang w:val="en-US"/>
+        </w:rPr>
+        <w:t xml:space="preserve">outputs from reframodel are stored in </w:t>
+      </w:r>
+      <w:r>
+        <w:rPr>
+          <w:lang w:val="en-US"/>
+        </w:rPr>
+        <w:t>“</w:t>
+      </w:r>
+      <w:r>
+        <w:rPr>
+          <w:lang w:val="en-US"/>
+        </w:rPr>
+        <w:t>Example/inversion_gradient</w:t>
+      </w:r>
+      <w:r>
+        <w:rPr>
+          <w:lang w:val="en-US"/>
+        </w:rPr>
+        <w:t>_model”</w:t>
+      </w:r>
+      <w:r>
+        <w:rPr>
+          <w:lang w:val="en-US"/>
+        </w:rPr>
+        <w:t>, and then starting with the interactive model, using the parameters shown in file “</w:t>
       </w:r>
       <w:r>
         <w:rPr>
@@ -358,21 +282,18 @@
         </w:rPr>
         <w:t>” in that folder. The program outputs for the two inversions are in folders “</w:t>
       </w:r>
-      <w:proofErr w:type="spellStart"/>
       <w:r>
         <w:rPr>
           <w:lang w:val="en-US"/>
         </w:rPr>
         <w:t>inversion_gradient_model</w:t>
       </w:r>
-      <w:proofErr w:type="spellEnd"/>
       <w:r>
         <w:rPr>
           <w:lang w:val="en-US"/>
         </w:rPr>
         <w:t>” and “</w:t>
       </w:r>
-      <w:proofErr w:type="spellStart"/>
       <w:r>
         <w:rPr>
           <w:lang w:val="en-US"/>
@@ -391,7 +312,6 @@
         </w:rPr>
         <w:t>_model</w:t>
       </w:r>
-      <w:proofErr w:type="spellEnd"/>
       <w:r>
         <w:rPr>
           <w:lang w:val="en-US"/>

</xml_diff>